<commit_message>
Align report section headings with official contest submission format
</commit_message>
<xml_diff>
--- a/보고서/진해벚꽃_개화예측_분석보고서_v6.docx
+++ b/보고서/진해벚꽃_개화예측_분석보고서_v6.docx
@@ -57,7 +57,7 @@
           <w:sz w:val="23"/>
           <w:szCs w:val="23"/>
         </w:rPr>
-        <w:t xml:space="preserve">Ⅰ. 제안과제명</w:t>
+        <w:t xml:space="preserve">Ⅰ. 제안과제명 :</w:t>
       </w:r>
     </w:p>
     <w:p>
@@ -92,7 +92,7 @@
         <w:spacing w:after="140" w:before="320"/>
       </w:pPr>
       <w:r>
-        <w:t xml:space="preserve">1. 분석 개요</w:t>
+        <w:t xml:space="preserve">◦ 분석 개요</w:t>
       </w:r>
     </w:p>
     <w:p>
@@ -235,7 +235,7 @@
         <w:spacing w:after="140" w:before="320"/>
       </w:pPr>
       <w:r>
-        <w:t xml:space="preserve">2. 분석 결과 상세 내용</w:t>
+        <w:t xml:space="preserve">◦ 분석 결과 상세 내용</w:t>
       </w:r>
     </w:p>
     <w:p>
@@ -1170,7 +1170,7 @@
         <w:spacing w:after="140" w:before="320"/>
       </w:pPr>
       <w:r>
-        <w:t xml:space="preserve">3. 결과 해석 및 시사점</w:t>
+        <w:t xml:space="preserve">◦ 결과 해석 및 시사점</w:t>
       </w:r>
     </w:p>
     <w:p>
@@ -2682,7 +2682,7 @@
         <w:spacing w:after="140" w:before="320"/>
       </w:pPr>
       <w:r>
-        <w:t xml:space="preserve">4. 활용방안 및 기대효과</w:t>
+        <w:t xml:space="preserve">◦ 활용방안 및 기대효과</w:t>
       </w:r>
     </w:p>
     <w:p>
@@ -3357,7 +3357,7 @@
         <w:spacing w:after="140" w:before="320"/>
       </w:pPr>
       <w:r>
-        <w:t xml:space="preserve">5. 활용데이터 및 참고문헌 출처</w:t>
+        <w:t xml:space="preserve">◦ 활용데이터 및 참고 문헌 출처 등</w:t>
       </w:r>
     </w:p>
     <w:p>

</xml_diff>